<commit_message>
feat: doc implementation process
</commit_message>
<xml_diff>
--- a/CSE531/Learner Template_CSE 531_Chase Coleman_gRPC_Written Report.docx
+++ b/CSE531/Learner Template_CSE 531_Chase Coleman_gRPC_Written Report.docx
@@ -360,12 +360,56 @@
         <w:ind w:left="0"/>
       </w:pPr>
       <w:r>
-        <w:rPr>
-          <w:rFonts w:ascii="Arial" w:hAnsi="Arial" w:eastAsia="Arial" w:cs="Arial"/>
-          <w:sz w:val="24"/>
-          <w:szCs w:val="24"/>
-        </w:rPr>
-        <w:t>[What are the implementation processes?]</w:t>
+        <w:t xml:space="preserve">First, the gRPC service was defined in </w:t>
+      </w:r>
+      <w:r>
+        <w:rPr>
+          <w:i/>
+          <w:iCs/>
+        </w:rPr>
+        <w:t xml:space="preserve">protos/branks.proto. </w:t>
+      </w:r>
+      <w:r>
+        <w:t xml:space="preserve">The service contains a MsgDelivery RPC that accepts a request and returns a response. Requests contain an event ID, an interface identifying the operation, and a money amount when applicable. Responses contain the branch's balance. The Protocol Buffers compiler generated the Python message and gRPC service modules from this definition. </w:t>
+      </w:r>
+    </w:p>
+    <w:p>
+      <w:pPr>
+        <w:spacing w:line="276" w:lineRule="auto"/>
+      </w:pPr>
+    </w:p>
+    <w:p>
+      <w:pPr>
+        <w:spacing w:line="276" w:lineRule="auto"/>
+      </w:pPr>
+      <w:r>
+        <w:t xml:space="preserve">Next, the Customer class was completed. Each customer creates a gRPC stub connected to the branch with the same ID. The customer uses the stub to submit its events and records successful responses. Query responses include the balance, while deposit and withdrawal responses are recorded as successful operations. </w:t>
+      </w:r>
+    </w:p>
+    <w:p>
+      <w:pPr>
+        <w:spacing w:line="276" w:lineRule="auto"/>
+      </w:pPr>
+    </w:p>
+    <w:p>
+      <w:pPr>
+        <w:spacing w:line="276" w:lineRule="auto"/>
+      </w:pPr>
+      <w:r>
+        <w:t>The Branch class was completed to handle incoming requests through MsgDelivery. A query returns the local balance. A deposit or withdrawal first updates the receiving branch's balance and then sends a propogation request to each other branch. A branch receiving a progated update changes its local balance without broadcasting the update again.</w:t>
+      </w:r>
+    </w:p>
+    <w:p>
+      <w:pPr>
+        <w:spacing w:line="276" w:lineRule="auto"/>
+      </w:pPr>
+    </w:p>
+    <w:p>
+      <w:pPr>
+        <w:spacing w:line="276" w:lineRule="auto"/>
+      </w:pPr>
+      <w:r>
+        <w:t xml:space="preserve">The program was organized into seperate server and client entry points. server.py reads the input and starts a seperate process and gRPC server for each branch. client.py reads the customer records, schedules events in ascending event-ID order, and runs customer processes. The client waits for each event to complete before sending the next one. Because propagation calls are synchronous, a customer update completes after the receiving branch has received responses from the other branches. After all events are processed, the client writes the customer responses to output.json and signlas the branch servers to shut down. </w:t>
       </w:r>
     </w:p>
     <w:p>
@@ -532,7 +576,7 @@
                   <pic:cNvPicPr/>
                 </pic:nvPicPr>
                 <pic:blipFill>
-                  <a:blip r:embed="rId3"/>
+                  <a:blip r:embed="rId4"/>
                   <a:stretch>
                     <a:fillRect/>
                   </a:stretch>

</xml_diff>